<commit_message>
feat(nancy): update Nancy's Master CV with latest 2026 experience, education, motto and skills (PDF & Word)
</commit_message>
<xml_diff>
--- a/docs/files/Nancy_Schuetze_Lebenslauf_Master.docx
+++ b/docs/files/Nancy_Schuetze_Lebenslauf_Master.docx
@@ -35,16 +35,29 @@
           </w:p>
           <w:p>
             <w:pPr>
-              <w:spacing w:after="80"/>
+              <w:spacing w:after="40"/>
             </w:pPr>
             <w:r>
               <w:rPr>
                 <w:rFonts w:ascii="Segoe UI" w:hAnsi="Segoe UI"/>
                 <w:b/>
                 <w:color w:val="1E3A8A"/>
-                <w:sz w:val="21"/>
+                <w:sz w:val="19"/>
               </w:rPr>
-              <w:t>Office Managerin &amp; Werkstudentin Backoffice / Teamassistenz</w:t>
+              <w:t>Energiegeladen · Lösungsorientiert · Lebensfroh</w:t>
+            </w:r>
+          </w:p>
+          <w:p>
+            <w:pPr>
+              <w:spacing w:after="60"/>
+            </w:pPr>
+            <w:r>
+              <w:rPr>
+                <w:rFonts w:ascii="Segoe UI" w:hAnsi="Segoe UI"/>
+                <w:color w:val="475569"/>
+                <w:sz w:val="16"/>
+              </w:rPr>
+              <w:t>Als Organisationstalent arbeite ich eigenständig, strukturiert und kreativ und bringe mit meiner positiven Art einen humorvollen Alltag.</w:t>
             </w:r>
           </w:p>
           <w:p>
@@ -67,7 +80,7 @@
                 <w:color w:val="475569"/>
                 <w:sz w:val="17"/>
               </w:rPr>
-              <w:t xml:space="preserve"> Teichbergstraße 17, 13125 Berlin    |    </w:t>
+              <w:t xml:space="preserve"> Teichbergstr. 17, 13125 Berlin    |    </w:t>
             </w:r>
             <w:r>
               <w:rPr>
@@ -85,7 +98,7 @@
                 <w:color w:val="475569"/>
                 <w:sz w:val="17"/>
               </w:rPr>
-              <w:t xml:space="preserve"> +49 1523 7164097</w:t>
+              <w:t xml:space="preserve"> +49 15237164097</w:t>
             </w:r>
           </w:p>
           <w:p>
@@ -117,7 +130,7 @@
                 <w:color w:val="475569"/>
                 <w:sz w:val="17"/>
               </w:rPr>
-              <w:t>Geboren:</w:t>
+              <w:t>LinkedIn:</w:t>
             </w:r>
             <w:r>
               <w:rPr>
@@ -126,7 +139,7 @@
                 <w:color w:val="475569"/>
                 <w:sz w:val="17"/>
               </w:rPr>
-              <w:t xml:space="preserve"> 17.08.2001 in Berlin | Staatsangehörigkeit: Deutsch</w:t>
+              <w:t xml:space="preserve"> LinkedIn Profile</w:t>
             </w:r>
           </w:p>
         </w:tc>
@@ -143,7 +156,7 @@
             <w:r>
               <w:drawing>
                 <wp:inline xmlns:a="http://schemas.openxmlformats.org/drawingml/2006/main" xmlns:pic="http://schemas.openxmlformats.org/drawingml/2006/picture">
-                  <wp:extent cx="954000" cy="1407065"/>
+                  <wp:extent cx="936000" cy="1380517"/>
                   <wp:docPr id="1" name="Picture 1"/>
                   <wp:cNvGraphicFramePr>
                     <a:graphicFrameLocks noChangeAspect="1"/>
@@ -164,7 +177,7 @@
                         <pic:spPr>
                           <a:xfrm>
                             <a:off x="0" y="0"/>
-                            <a:ext cx="954000" cy="1407065"/>
+                            <a:ext cx="936000" cy="1380517"/>
                           </a:xfrm>
                           <a:prstGeom prst="rect"/>
                         </pic:spPr>
@@ -180,7 +193,7 @@
     </w:tbl>
     <w:p>
       <w:pPr>
-        <w:spacing w:before="0" w:after="60"/>
+        <w:spacing w:before="0" w:after="50"/>
         <w:pBdr>
           <w:bottom w:val="single" w:sz="14" w:space="2" w:color="1E3A8A"/>
         </w:pBdr>
@@ -216,12 +229,12 @@
       <w:tr>
         <w:tc>
           <w:tcPr>
-            <w:tcW w:type="dxa" w:w="1644"/>
+            <w:tcW w:type="dxa" w:w="1587"/>
             <w:tcMar>
-              <w:top w:w="25" w:type="dxa"/>
-              <w:bottom w:w="25" w:type="dxa"/>
+              <w:top w:w="18" w:type="dxa"/>
+              <w:bottom w:w="18" w:type="dxa"/>
               <w:left w:w="0" w:type="dxa"/>
-              <w:right w:w="60" w:type="dxa"/>
+              <w:right w:w="50" w:type="dxa"/>
             </w:tcMar>
           </w:tcPr>
           <w:p>
@@ -233,41 +246,41 @@
                 <w:rFonts w:ascii="Segoe UI" w:hAnsi="Segoe UI"/>
                 <w:b/>
                 <w:color w:val="475569"/>
-                <w:sz w:val="17"/>
+                <w:sz w:val="16"/>
               </w:rPr>
-              <w:t>2025 – 2026</w:t>
+              <w:t>2019 – heute</w:t>
             </w:r>
           </w:p>
         </w:tc>
         <w:tc>
           <w:tcPr>
-            <w:tcW w:type="dxa" w:w="8901"/>
+            <w:tcW w:type="dxa" w:w="8957"/>
             <w:tcMar>
-              <w:top w:w="25" w:type="dxa"/>
-              <w:bottom w:w="25" w:type="dxa"/>
+              <w:top w:w="18" w:type="dxa"/>
+              <w:bottom w:w="18" w:type="dxa"/>
               <w:left w:w="0" w:type="dxa"/>
               <w:right w:w="0" w:type="dxa"/>
             </w:tcMar>
           </w:tcPr>
           <w:p>
             <w:pPr>
-              <w:spacing w:after="30"/>
+              <w:spacing w:after="20"/>
             </w:pPr>
             <w:r>
               <w:rPr>
                 <w:rFonts w:ascii="Segoe UI" w:hAnsi="Segoe UI"/>
                 <w:b/>
                 <w:color w:val="0F172A"/>
-                <w:sz w:val="18"/>
+                <w:sz w:val="17"/>
               </w:rPr>
-              <w:t>Office Managerin &amp; Kanzleiassistenz</w:t>
+              <w:t>Projektleitung, Teamleitung, Hostess &amp; Promotorin</w:t>
             </w:r>
             <w:r>
               <w:rPr>
                 <w:rFonts w:ascii="Segoe UI" w:hAnsi="Segoe UI"/>
                 <w:b w:val="0"/>
                 <w:color w:val="0F172A"/>
-                <w:sz w:val="18"/>
+                <w:sz w:val="17"/>
               </w:rPr>
               <w:t xml:space="preserve"> | </w:t>
             </w:r>
@@ -276,57 +289,9 @@
                 <w:rFonts w:ascii="Segoe UI" w:hAnsi="Segoe UI"/>
                 <w:b/>
                 <w:color w:val="0F172A"/>
-                <w:sz w:val="18"/>
-              </w:rPr>
-              <w:t>SERS Rechtsanwaltsgesellschaft mbH</w:t>
-            </w:r>
-            <w:r>
-              <w:rPr>
-                <w:rFonts w:ascii="Segoe UI" w:hAnsi="Segoe UI"/>
-                <w:b w:val="0"/>
-                <w:color w:val="0F172A"/>
-                <w:sz w:val="18"/>
-              </w:rPr>
-              <w:t>, Berlin</w:t>
-            </w:r>
-          </w:p>
-          <w:p>
-            <w:pPr>
-              <w:spacing w:after="24"/>
-              <w:ind w:left="198" w:hanging="198"/>
-            </w:pPr>
-            <w:r>
-              <w:rPr>
-                <w:rFonts w:ascii="Segoe UI" w:hAnsi="Segoe UI"/>
-                <w:b w:val="0"/>
-                <w:color w:val="0F172A"/>
                 <w:sz w:val="17"/>
               </w:rPr>
-              <w:t>•  Eigenverantwortliche Organisation und Steuerung des gesamten Kanzlei- und Sekretariatsbetriebs.</w:t>
-            </w:r>
-          </w:p>
-          <w:p>
-            <w:pPr>
-              <w:spacing w:after="24"/>
-              <w:ind w:left="198" w:hanging="198"/>
-            </w:pPr>
-            <w:r>
-              <w:rPr>
-                <w:rFonts w:ascii="Segoe UI" w:hAnsi="Segoe UI"/>
-                <w:b w:val="0"/>
-                <w:color w:val="0F172A"/>
-                <w:sz w:val="17"/>
-              </w:rPr>
-              <w:t xml:space="preserve">•  Professionelle schriftliche und telefonische Kommunikation mit Mandanten, Gerichten und Behörden auf </w:t>
-            </w:r>
-            <w:r>
-              <w:rPr>
-                <w:rFonts w:ascii="Segoe UI" w:hAnsi="Segoe UI"/>
-                <w:b/>
-                <w:color w:val="0F172A"/>
-                <w:sz w:val="17"/>
-              </w:rPr>
-              <w:t>Deutsch und Englisch (C2)</w:t>
+              <w:t>verschiedene Agenturen</w:t>
             </w:r>
             <w:r>
               <w:rPr>
@@ -335,12 +300,12 @@
                 <w:color w:val="0F172A"/>
                 <w:sz w:val="17"/>
               </w:rPr>
-              <w:t>.</w:t>
+              <w:t>, Berlin &amp; bundesweit</w:t>
             </w:r>
           </w:p>
           <w:p>
             <w:pPr>
-              <w:spacing w:after="24"/>
+              <w:spacing w:after="20"/>
               <w:ind w:left="198" w:hanging="198"/>
             </w:pPr>
             <w:r>
@@ -348,32 +313,14 @@
                 <w:rFonts w:ascii="Segoe UI" w:hAnsi="Segoe UI"/>
                 <w:b w:val="0"/>
                 <w:color w:val="0F172A"/>
-                <w:sz w:val="17"/>
+                <w:sz w:val="16"/>
               </w:rPr>
-              <w:t xml:space="preserve">•  Strukturierte Dokumentenorganisation, Fristenkontrolle, Aktenführung sowie </w:t>
-            </w:r>
-            <w:r>
-              <w:rPr>
-                <w:rFonts w:ascii="Segoe UI" w:hAnsi="Segoe UI"/>
-                <w:b/>
-                <w:color w:val="0F172A"/>
-                <w:sz w:val="17"/>
-              </w:rPr>
-              <w:t>vorbereitende Buchhaltung und Rechnungserstellung</w:t>
-            </w:r>
-            <w:r>
-              <w:rPr>
-                <w:rFonts w:ascii="Segoe UI" w:hAnsi="Segoe UI"/>
-                <w:b w:val="0"/>
-                <w:color w:val="0F172A"/>
-                <w:sz w:val="17"/>
-              </w:rPr>
-              <w:t>.</w:t>
+              <w:t>•  Eigenständige Koordination von Vor-Ort-Teams von bis zu 60 Personen bei Events, Messen und Kongressen.</w:t>
             </w:r>
           </w:p>
           <w:p>
             <w:pPr>
-              <w:spacing w:after="24"/>
+              <w:spacing w:after="20"/>
               <w:ind w:left="198" w:hanging="198"/>
             </w:pPr>
             <w:r>
@@ -381,27 +328,9 @@
                 <w:rFonts w:ascii="Segoe UI" w:hAnsi="Segoe UI"/>
                 <w:b w:val="0"/>
                 <w:color w:val="0F172A"/>
-                <w:sz w:val="17"/>
+                <w:sz w:val="16"/>
               </w:rPr>
-              <w:t xml:space="preserve">•  Kontinuierliche </w:t>
-            </w:r>
-            <w:r>
-              <w:rPr>
-                <w:rFonts w:ascii="Segoe UI" w:hAnsi="Segoe UI"/>
-                <w:b/>
-                <w:color w:val="0F172A"/>
-                <w:sz w:val="17"/>
-              </w:rPr>
-              <w:t>Prozessoptimierung, Digitalisierung</w:t>
-            </w:r>
-            <w:r>
-              <w:rPr>
-                <w:rFonts w:ascii="Segoe UI" w:hAnsi="Segoe UI"/>
-                <w:b w:val="0"/>
-                <w:color w:val="0F172A"/>
-                <w:sz w:val="17"/>
-              </w:rPr>
-              <w:t xml:space="preserve"> von Büroabläufen und Qualitätsmanagement.</w:t>
+              <w:t>•  Zentrale Ansprechpartnerin für Kunden und Auftraggeber zur Sicherstellung eines reibungslosen Ablaufs.</w:t>
             </w:r>
           </w:p>
         </w:tc>
@@ -409,12 +338,12 @@
       <w:tr>
         <w:tc>
           <w:tcPr>
-            <w:tcW w:type="dxa" w:w="1644"/>
+            <w:tcW w:type="dxa" w:w="1587"/>
             <w:tcMar>
-              <w:top w:w="25" w:type="dxa"/>
-              <w:bottom w:w="25" w:type="dxa"/>
+              <w:top w:w="18" w:type="dxa"/>
+              <w:bottom w:w="18" w:type="dxa"/>
               <w:left w:w="0" w:type="dxa"/>
-              <w:right w:w="60" w:type="dxa"/>
+              <w:right w:w="50" w:type="dxa"/>
             </w:tcMar>
           </w:tcPr>
           <w:p>
@@ -426,41 +355,41 @@
                 <w:rFonts w:ascii="Segoe UI" w:hAnsi="Segoe UI"/>
                 <w:b/>
                 <w:color w:val="475569"/>
-                <w:sz w:val="17"/>
+                <w:sz w:val="16"/>
               </w:rPr>
-              <w:t>2023 – 2025</w:t>
+              <w:t>2025 – 2026</w:t>
             </w:r>
           </w:p>
         </w:tc>
         <w:tc>
           <w:tcPr>
-            <w:tcW w:type="dxa" w:w="8901"/>
+            <w:tcW w:type="dxa" w:w="8957"/>
             <w:tcMar>
-              <w:top w:w="25" w:type="dxa"/>
-              <w:bottom w:w="25" w:type="dxa"/>
+              <w:top w:w="18" w:type="dxa"/>
+              <w:bottom w:w="18" w:type="dxa"/>
               <w:left w:w="0" w:type="dxa"/>
               <w:right w:w="0" w:type="dxa"/>
             </w:tcMar>
           </w:tcPr>
           <w:p>
             <w:pPr>
-              <w:spacing w:after="30"/>
+              <w:spacing w:after="20"/>
             </w:pPr>
             <w:r>
               <w:rPr>
                 <w:rFonts w:ascii="Segoe UI" w:hAnsi="Segoe UI"/>
                 <w:b/>
                 <w:color w:val="0F172A"/>
-                <w:sz w:val="18"/>
+                <w:sz w:val="17"/>
               </w:rPr>
-              <w:t>Junior Projektleitung &amp; Office Operations</w:t>
+              <w:t>Office Manager, Bürofachangestellte</w:t>
             </w:r>
             <w:r>
               <w:rPr>
                 <w:rFonts w:ascii="Segoe UI" w:hAnsi="Segoe UI"/>
                 <w:b w:val="0"/>
                 <w:color w:val="0F172A"/>
-                <w:sz w:val="18"/>
+                <w:sz w:val="17"/>
               </w:rPr>
               <w:t xml:space="preserve"> | </w:t>
             </w:r>
@@ -469,42 +398,9 @@
                 <w:rFonts w:ascii="Segoe UI" w:hAnsi="Segoe UI"/>
                 <w:b/>
                 <w:color w:val="0F172A"/>
-                <w:sz w:val="18"/>
-              </w:rPr>
-              <w:t>zett.events</w:t>
-            </w:r>
-            <w:r>
-              <w:rPr>
-                <w:rFonts w:ascii="Segoe UI" w:hAnsi="Segoe UI"/>
-                <w:b w:val="0"/>
-                <w:color w:val="0F172A"/>
-                <w:sz w:val="18"/>
-              </w:rPr>
-              <w:t>, Berlin</w:t>
-            </w:r>
-          </w:p>
-          <w:p>
-            <w:pPr>
-              <w:spacing w:after="24"/>
-              <w:ind w:left="198" w:hanging="198"/>
-            </w:pPr>
-            <w:r>
-              <w:rPr>
-                <w:rFonts w:ascii="Segoe UI" w:hAnsi="Segoe UI"/>
-                <w:b w:val="0"/>
-                <w:color w:val="0F172A"/>
                 <w:sz w:val="17"/>
               </w:rPr>
-              <w:t xml:space="preserve">•  Kaufmännische und organisatorische Planung von Projekten inklusive </w:t>
-            </w:r>
-            <w:r>
-              <w:rPr>
-                <w:rFonts w:ascii="Segoe UI" w:hAnsi="Segoe UI"/>
-                <w:b/>
-                <w:color w:val="0F172A"/>
-                <w:sz w:val="17"/>
-              </w:rPr>
-              <w:t>Personal-, Event- und Budgetsteuerung</w:t>
+              <w:t>SERS Rechtsanwaltsgesellschaft mbH</w:t>
             </w:r>
             <w:r>
               <w:rPr>
@@ -513,12 +409,12 @@
                 <w:color w:val="0F172A"/>
                 <w:sz w:val="17"/>
               </w:rPr>
-              <w:t>.</w:t>
+              <w:t>, Berlin</w:t>
             </w:r>
           </w:p>
           <w:p>
             <w:pPr>
-              <w:spacing w:after="24"/>
+              <w:spacing w:after="20"/>
               <w:ind w:left="198" w:hanging="198"/>
             </w:pPr>
             <w:r>
@@ -526,32 +422,14 @@
                 <w:rFonts w:ascii="Segoe UI" w:hAnsi="Segoe UI"/>
                 <w:b w:val="0"/>
                 <w:color w:val="0F172A"/>
-                <w:sz w:val="17"/>
+                <w:sz w:val="16"/>
               </w:rPr>
-              <w:t xml:space="preserve">•  Interne Koordination, Einsatzplanung sowie </w:t>
-            </w:r>
-            <w:r>
-              <w:rPr>
-                <w:rFonts w:ascii="Segoe UI" w:hAnsi="Segoe UI"/>
-                <w:b/>
-                <w:color w:val="0F172A"/>
-                <w:sz w:val="17"/>
-              </w:rPr>
-              <w:t>Mitarbeiterabrechnungen für Werkstudierende und Aushilfen</w:t>
-            </w:r>
-            <w:r>
-              <w:rPr>
-                <w:rFonts w:ascii="Segoe UI" w:hAnsi="Segoe UI"/>
-                <w:b w:val="0"/>
-                <w:color w:val="0F172A"/>
-                <w:sz w:val="17"/>
-              </w:rPr>
-              <w:t>.</w:t>
+              <w:t>•  Eigenverantwortliche Organisation und Koordination des Sekretariats- &amp; Kanzleibüros.</w:t>
             </w:r>
           </w:p>
           <w:p>
             <w:pPr>
-              <w:spacing w:after="24"/>
+              <w:spacing w:after="20"/>
               <w:ind w:left="198" w:hanging="198"/>
             </w:pPr>
             <w:r>
@@ -559,32 +437,14 @@
                 <w:rFonts w:ascii="Segoe UI" w:hAnsi="Segoe UI"/>
                 <w:b w:val="0"/>
                 <w:color w:val="0F172A"/>
-                <w:sz w:val="17"/>
+                <w:sz w:val="16"/>
               </w:rPr>
-              <w:t xml:space="preserve">•  Eigenständige </w:t>
-            </w:r>
-            <w:r>
-              <w:rPr>
-                <w:rFonts w:ascii="Segoe UI" w:hAnsi="Segoe UI"/>
-                <w:b/>
-                <w:color w:val="0F172A"/>
-                <w:sz w:val="17"/>
-              </w:rPr>
-              <w:t>Angebotskalkulation und Rechnungserstellung</w:t>
-            </w:r>
-            <w:r>
-              <w:rPr>
-                <w:rFonts w:ascii="Segoe UI" w:hAnsi="Segoe UI"/>
-                <w:b w:val="0"/>
-                <w:color w:val="0F172A"/>
-                <w:sz w:val="17"/>
-              </w:rPr>
-              <w:t xml:space="preserve"> sowie Kunden- und Dienstleisterbetreuung.</w:t>
+              <w:t>•  Professionelle Kommunikation mit Mandanten &amp; Behörden (in deutscher &amp; englischer Sprache auf C2-Niveau).</w:t>
             </w:r>
           </w:p>
           <w:p>
             <w:pPr>
-              <w:spacing w:after="24"/>
+              <w:spacing w:after="20"/>
               <w:ind w:left="198" w:hanging="198"/>
             </w:pPr>
             <w:r>
@@ -592,9 +452,9 @@
                 <w:rFonts w:ascii="Segoe UI" w:hAnsi="Segoe UI"/>
                 <w:b w:val="0"/>
                 <w:color w:val="0F172A"/>
-                <w:sz w:val="17"/>
+                <w:sz w:val="16"/>
               </w:rPr>
-              <w:t>•  Weiterentwicklung interner Verwaltungsstrukturen durch Digitalisierung und Prozessoptimierung.</w:t>
+              <w:t>•  Optimierung von internen IT-Prozessen, digitale Dokumentenverwaltung &amp; Qualitätssicherung.</w:t>
             </w:r>
           </w:p>
         </w:tc>
@@ -602,12 +462,12 @@
       <w:tr>
         <w:tc>
           <w:tcPr>
-            <w:tcW w:type="dxa" w:w="1644"/>
+            <w:tcW w:type="dxa" w:w="1587"/>
             <w:tcMar>
-              <w:top w:w="25" w:type="dxa"/>
-              <w:bottom w:w="25" w:type="dxa"/>
+              <w:top w:w="18" w:type="dxa"/>
+              <w:bottom w:w="18" w:type="dxa"/>
               <w:left w:w="0" w:type="dxa"/>
-              <w:right w:w="60" w:type="dxa"/>
+              <w:right w:w="50" w:type="dxa"/>
             </w:tcMar>
           </w:tcPr>
           <w:p>
@@ -619,41 +479,41 @@
                 <w:rFonts w:ascii="Segoe UI" w:hAnsi="Segoe UI"/>
                 <w:b/>
                 <w:color w:val="475569"/>
-                <w:sz w:val="17"/>
+                <w:sz w:val="16"/>
               </w:rPr>
-              <w:t>2019 – heute</w:t>
+              <w:t>2023 – 2025</w:t>
             </w:r>
           </w:p>
         </w:tc>
         <w:tc>
           <w:tcPr>
-            <w:tcW w:type="dxa" w:w="8901"/>
+            <w:tcW w:type="dxa" w:w="8957"/>
             <w:tcMar>
-              <w:top w:w="25" w:type="dxa"/>
-              <w:bottom w:w="25" w:type="dxa"/>
+              <w:top w:w="18" w:type="dxa"/>
+              <w:bottom w:w="18" w:type="dxa"/>
               <w:left w:w="0" w:type="dxa"/>
               <w:right w:w="0" w:type="dxa"/>
             </w:tcMar>
           </w:tcPr>
           <w:p>
             <w:pPr>
-              <w:spacing w:after="30"/>
+              <w:spacing w:after="20"/>
             </w:pPr>
             <w:r>
               <w:rPr>
                 <w:rFonts w:ascii="Segoe UI" w:hAnsi="Segoe UI"/>
                 <w:b/>
                 <w:color w:val="0F172A"/>
-                <w:sz w:val="18"/>
+                <w:sz w:val="17"/>
               </w:rPr>
-              <w:t>Teamleitung Events, Hostess &amp; Promotion (Nebenberuflich)</w:t>
+              <w:t>Junior Projektleitung</w:t>
             </w:r>
             <w:r>
               <w:rPr>
                 <w:rFonts w:ascii="Segoe UI" w:hAnsi="Segoe UI"/>
                 <w:b w:val="0"/>
                 <w:color w:val="0F172A"/>
-                <w:sz w:val="18"/>
+                <w:sz w:val="17"/>
               </w:rPr>
               <w:t xml:space="preserve"> | </w:t>
             </w:r>
@@ -662,42 +522,9 @@
                 <w:rFonts w:ascii="Segoe UI" w:hAnsi="Segoe UI"/>
                 <w:b/>
                 <w:color w:val="0F172A"/>
-                <w:sz w:val="18"/>
-              </w:rPr>
-              <w:t>Verschiedene Event- und Promotionagenturen</w:t>
-            </w:r>
-            <w:r>
-              <w:rPr>
-                <w:rFonts w:ascii="Segoe UI" w:hAnsi="Segoe UI"/>
-                <w:b w:val="0"/>
-                <w:color w:val="0F172A"/>
-                <w:sz w:val="18"/>
-              </w:rPr>
-              <w:t>, Berlin &amp; bundesweit</w:t>
-            </w:r>
-          </w:p>
-          <w:p>
-            <w:pPr>
-              <w:spacing w:after="24"/>
-              <w:ind w:left="198" w:hanging="198"/>
-            </w:pPr>
-            <w:r>
-              <w:rPr>
-                <w:rFonts w:ascii="Segoe UI" w:hAnsi="Segoe UI"/>
-                <w:b w:val="0"/>
-                <w:color w:val="0F172A"/>
                 <w:sz w:val="17"/>
               </w:rPr>
-              <w:t xml:space="preserve">•  Vor-Ort-Teamleitung: Check-In, Briefing und </w:t>
-            </w:r>
-            <w:r>
-              <w:rPr>
-                <w:rFonts w:ascii="Segoe UI" w:hAnsi="Segoe UI"/>
-                <w:b/>
-                <w:color w:val="0F172A"/>
-                <w:sz w:val="17"/>
-              </w:rPr>
-              <w:t>Koordination der Einsatzteams</w:t>
+              <w:t>zett.events</w:t>
             </w:r>
             <w:r>
               <w:rPr>
@@ -706,12 +533,12 @@
                 <w:color w:val="0F172A"/>
                 <w:sz w:val="17"/>
               </w:rPr>
-              <w:t xml:space="preserve"> bei Messen, Kongressen und Corporate Events.</w:t>
+              <w:t>, Berlin</w:t>
             </w:r>
           </w:p>
           <w:p>
             <w:pPr>
-              <w:spacing w:after="24"/>
+              <w:spacing w:after="20"/>
               <w:ind w:left="198" w:hanging="198"/>
             </w:pPr>
             <w:r>
@@ -719,9 +546,69 @@
                 <w:rFonts w:ascii="Segoe UI" w:hAnsi="Segoe UI"/>
                 <w:b w:val="0"/>
                 <w:color w:val="0F172A"/>
-                <w:sz w:val="17"/>
+                <w:sz w:val="16"/>
               </w:rPr>
-              <w:t>•  Direkte Ansprechpartnerin für Auftraggeber vor Ort sowie Sicherstellung eines reibungslosen Serviceablaufs.</w:t>
+              <w:t>•  Event- &amp; Personalplanung für führende Marken wie Coca-Cola sowie Großevents wie die Volkswagen Drive Experience zur Fußball-EM 2024.</w:t>
+            </w:r>
+          </w:p>
+          <w:p>
+            <w:pPr>
+              <w:spacing w:after="20"/>
+              <w:ind w:left="198" w:hanging="198"/>
+            </w:pPr>
+            <w:r>
+              <w:rPr>
+                <w:rFonts w:ascii="Segoe UI" w:hAnsi="Segoe UI"/>
+                <w:b w:val="0"/>
+                <w:color w:val="0F172A"/>
+                <w:sz w:val="16"/>
+              </w:rPr>
+              <w:t>•  Allgemeine Organisation des Büros sowie administrative Unterstützung der Geschäftsführung.</w:t>
+            </w:r>
+          </w:p>
+          <w:p>
+            <w:pPr>
+              <w:spacing w:after="20"/>
+              <w:ind w:left="198" w:hanging="198"/>
+            </w:pPr>
+            <w:r>
+              <w:rPr>
+                <w:rFonts w:ascii="Segoe UI" w:hAnsi="Segoe UI"/>
+                <w:b w:val="0"/>
+                <w:color w:val="0F172A"/>
+                <w:sz w:val="16"/>
+              </w:rPr>
+              <w:t>•  Koordination, Einsatzplanung und Betreuung von Werkstudenten &amp; Aushilfen.</w:t>
+            </w:r>
+          </w:p>
+          <w:p>
+            <w:pPr>
+              <w:spacing w:after="20"/>
+              <w:ind w:left="198" w:hanging="198"/>
+            </w:pPr>
+            <w:r>
+              <w:rPr>
+                <w:rFonts w:ascii="Segoe UI" w:hAnsi="Segoe UI"/>
+                <w:b w:val="0"/>
+                <w:color w:val="0F172A"/>
+                <w:sz w:val="16"/>
+              </w:rPr>
+              <w:t>•  Kaufmännische Angebotserstellung, Abrechnungswesen &amp; vorbereitende Buchhaltung.</w:t>
+            </w:r>
+          </w:p>
+          <w:p>
+            <w:pPr>
+              <w:spacing w:after="20"/>
+              <w:ind w:left="198" w:hanging="198"/>
+            </w:pPr>
+            <w:r>
+              <w:rPr>
+                <w:rFonts w:ascii="Segoe UI" w:hAnsi="Segoe UI"/>
+                <w:b w:val="0"/>
+                <w:color w:val="0F172A"/>
+                <w:sz w:val="16"/>
+              </w:rPr>
+              <w:t>•  Implementierung neuer digitaler IT-Prozesse zur Workflow-Optimierung.</w:t>
             </w:r>
           </w:p>
         </w:tc>
@@ -729,12 +616,12 @@
       <w:tr>
         <w:tc>
           <w:tcPr>
-            <w:tcW w:type="dxa" w:w="1644"/>
+            <w:tcW w:type="dxa" w:w="1587"/>
             <w:tcMar>
-              <w:top w:w="25" w:type="dxa"/>
-              <w:bottom w:w="25" w:type="dxa"/>
+              <w:top w:w="18" w:type="dxa"/>
+              <w:bottom w:w="18" w:type="dxa"/>
               <w:left w:w="0" w:type="dxa"/>
-              <w:right w:w="60" w:type="dxa"/>
+              <w:right w:w="50" w:type="dxa"/>
             </w:tcMar>
           </w:tcPr>
           <w:p>
@@ -746,41 +633,41 @@
                 <w:rFonts w:ascii="Segoe UI" w:hAnsi="Segoe UI"/>
                 <w:b/>
                 <w:color w:val="475569"/>
-                <w:sz w:val="17"/>
+                <w:sz w:val="16"/>
               </w:rPr>
-              <w:t>2021 – 2022</w:t>
+              <w:t>2019 – 2022</w:t>
             </w:r>
           </w:p>
         </w:tc>
         <w:tc>
           <w:tcPr>
-            <w:tcW w:type="dxa" w:w="8901"/>
+            <w:tcW w:type="dxa" w:w="8957"/>
             <w:tcMar>
-              <w:top w:w="25" w:type="dxa"/>
-              <w:bottom w:w="25" w:type="dxa"/>
+              <w:top w:w="18" w:type="dxa"/>
+              <w:bottom w:w="18" w:type="dxa"/>
               <w:left w:w="0" w:type="dxa"/>
               <w:right w:w="0" w:type="dxa"/>
             </w:tcMar>
           </w:tcPr>
           <w:p>
             <w:pPr>
-              <w:spacing w:after="30"/>
+              <w:spacing w:after="20"/>
             </w:pPr>
             <w:r>
               <w:rPr>
                 <w:rFonts w:ascii="Segoe UI" w:hAnsi="Segoe UI"/>
                 <w:b/>
                 <w:color w:val="0F172A"/>
-                <w:sz w:val="18"/>
+                <w:sz w:val="17"/>
               </w:rPr>
-              <w:t>Werkstudentin Qualitätsmanagement, Recruiting &amp; PR</w:t>
+              <w:t>Duale Studentin</w:t>
             </w:r>
             <w:r>
               <w:rPr>
                 <w:rFonts w:ascii="Segoe UI" w:hAnsi="Segoe UI"/>
                 <w:b w:val="0"/>
                 <w:color w:val="0F172A"/>
-                <w:sz w:val="18"/>
+                <w:sz w:val="17"/>
               </w:rPr>
               <w:t xml:space="preserve"> | </w:t>
             </w:r>
@@ -789,42 +676,9 @@
                 <w:rFonts w:ascii="Segoe UI" w:hAnsi="Segoe UI"/>
                 <w:b/>
                 <w:color w:val="0F172A"/>
-                <w:sz w:val="18"/>
-              </w:rPr>
-              <w:t>Vergleich.org (VGL Publishing AG)</w:t>
-            </w:r>
-            <w:r>
-              <w:rPr>
-                <w:rFonts w:ascii="Segoe UI" w:hAnsi="Segoe UI"/>
-                <w:b w:val="0"/>
-                <w:color w:val="0F172A"/>
-                <w:sz w:val="18"/>
-              </w:rPr>
-              <w:t>, Berlin</w:t>
-            </w:r>
-          </w:p>
-          <w:p>
-            <w:pPr>
-              <w:spacing w:after="24"/>
-              <w:ind w:left="198" w:hanging="198"/>
-            </w:pPr>
-            <w:r>
-              <w:rPr>
-                <w:rFonts w:ascii="Segoe UI" w:hAnsi="Segoe UI"/>
-                <w:b w:val="0"/>
-                <w:color w:val="0F172A"/>
                 <w:sz w:val="17"/>
               </w:rPr>
-              <w:t xml:space="preserve">•  </w:t>
-            </w:r>
-            <w:r>
-              <w:rPr>
-                <w:rFonts w:ascii="Segoe UI" w:hAnsi="Segoe UI"/>
-                <w:b/>
-                <w:color w:val="0F172A"/>
-                <w:sz w:val="17"/>
-              </w:rPr>
-              <w:t>Recruiting, Vertragsabwicklung und Onboarding</w:t>
+              <w:t>Novotel Suites, Ibis und Ibis Budget (ACCOR Hotels)</w:t>
             </w:r>
             <w:r>
               <w:rPr>
@@ -833,12 +687,12 @@
                 <w:color w:val="0F172A"/>
                 <w:sz w:val="17"/>
               </w:rPr>
-              <w:t xml:space="preserve"> neuer Freelancer sowie Koordination externer Dienstleister.</w:t>
+              <w:t>, Berlin</w:t>
             </w:r>
           </w:p>
           <w:p>
             <w:pPr>
-              <w:spacing w:after="24"/>
+              <w:spacing w:after="20"/>
               <w:ind w:left="198" w:hanging="198"/>
             </w:pPr>
             <w:r>
@@ -846,9 +700,24 @@
                 <w:rFonts w:ascii="Segoe UI" w:hAnsi="Segoe UI"/>
                 <w:b w:val="0"/>
                 <w:color w:val="0F172A"/>
-                <w:sz w:val="17"/>
+                <w:sz w:val="16"/>
               </w:rPr>
-              <w:t>•  Qualitätssicherung, Lektorat von Produkttexten sowie technische Pflege von XML- und HTML-Dateien.</w:t>
+              <w:t>•  Praktische Ausbildung und operative Rotation in den Bereichen Front Office, Housekeeping, Service &amp; Bar.</w:t>
+            </w:r>
+          </w:p>
+          <w:p>
+            <w:pPr>
+              <w:spacing w:after="20"/>
+              <w:ind w:left="198" w:hanging="198"/>
+            </w:pPr>
+            <w:r>
+              <w:rPr>
+                <w:rFonts w:ascii="Segoe UI" w:hAnsi="Segoe UI"/>
+                <w:b w:val="0"/>
+                <w:color w:val="0F172A"/>
+                <w:sz w:val="16"/>
+              </w:rPr>
+              <w:t>•  Eigenverantwortliche Vertretung der Executive Housekeeperin inklusive Schicht- und Qualitätsleitung.</w:t>
             </w:r>
           </w:p>
         </w:tc>
@@ -856,12 +725,12 @@
       <w:tr>
         <w:tc>
           <w:tcPr>
-            <w:tcW w:type="dxa" w:w="1644"/>
+            <w:tcW w:type="dxa" w:w="1587"/>
             <w:tcMar>
-              <w:top w:w="25" w:type="dxa"/>
-              <w:bottom w:w="25" w:type="dxa"/>
+              <w:top w:w="18" w:type="dxa"/>
+              <w:bottom w:w="18" w:type="dxa"/>
               <w:left w:w="0" w:type="dxa"/>
-              <w:right w:w="60" w:type="dxa"/>
+              <w:right w:w="50" w:type="dxa"/>
             </w:tcMar>
           </w:tcPr>
           <w:p>
@@ -873,41 +742,41 @@
                 <w:rFonts w:ascii="Segoe UI" w:hAnsi="Segoe UI"/>
                 <w:b/>
                 <w:color w:val="475569"/>
-                <w:sz w:val="17"/>
+                <w:sz w:val="16"/>
               </w:rPr>
-              <w:t>2019 – 2022</w:t>
+              <w:t>2013 – 2025</w:t>
             </w:r>
           </w:p>
         </w:tc>
         <w:tc>
           <w:tcPr>
-            <w:tcW w:type="dxa" w:w="8901"/>
+            <w:tcW w:type="dxa" w:w="8957"/>
             <w:tcMar>
-              <w:top w:w="25" w:type="dxa"/>
-              <w:bottom w:w="25" w:type="dxa"/>
+              <w:top w:w="18" w:type="dxa"/>
+              <w:bottom w:w="18" w:type="dxa"/>
               <w:left w:w="0" w:type="dxa"/>
               <w:right w:w="0" w:type="dxa"/>
             </w:tcMar>
           </w:tcPr>
           <w:p>
             <w:pPr>
-              <w:spacing w:after="30"/>
+              <w:spacing w:after="20"/>
             </w:pPr>
             <w:r>
               <w:rPr>
                 <w:rFonts w:ascii="Segoe UI" w:hAnsi="Segoe UI"/>
                 <w:b/>
                 <w:color w:val="0F172A"/>
-                <w:sz w:val="18"/>
+                <w:sz w:val="17"/>
               </w:rPr>
-              <w:t>Duale Studentin – Front &amp; Back Office / Hospitality Management</w:t>
+              <w:t>Verkäuferin im LEH-Familienbetrieb</w:t>
             </w:r>
             <w:r>
               <w:rPr>
                 <w:rFonts w:ascii="Segoe UI" w:hAnsi="Segoe UI"/>
                 <w:b w:val="0"/>
                 <w:color w:val="0F172A"/>
-                <w:sz w:val="18"/>
+                <w:sz w:val="17"/>
               </w:rPr>
               <w:t xml:space="preserve"> | </w:t>
             </w:r>
@@ -916,42 +785,9 @@
                 <w:rFonts w:ascii="Segoe UI" w:hAnsi="Segoe UI"/>
                 <w:b/>
                 <w:color w:val="0F172A"/>
-                <w:sz w:val="18"/>
-              </w:rPr>
-              <w:t>Accor Hotels (Novotel Suites, Ibis &amp; Ibis Budget)</w:t>
-            </w:r>
-            <w:r>
-              <w:rPr>
-                <w:rFonts w:ascii="Segoe UI" w:hAnsi="Segoe UI"/>
-                <w:b w:val="0"/>
-                <w:color w:val="0F172A"/>
-                <w:sz w:val="18"/>
-              </w:rPr>
-              <w:t>, Berlin</w:t>
-            </w:r>
-          </w:p>
-          <w:p>
-            <w:pPr>
-              <w:spacing w:after="24"/>
-              <w:ind w:left="198" w:hanging="198"/>
-            </w:pPr>
-            <w:r>
-              <w:rPr>
-                <w:rFonts w:ascii="Segoe UI" w:hAnsi="Segoe UI"/>
-                <w:b w:val="0"/>
-                <w:color w:val="0F172A"/>
                 <w:sz w:val="17"/>
               </w:rPr>
-              <w:t xml:space="preserve">•  Operative Steuerung im </w:t>
-            </w:r>
-            <w:r>
-              <w:rPr>
-                <w:rFonts w:ascii="Segoe UI" w:hAnsi="Segoe UI"/>
-                <w:b/>
-                <w:color w:val="0F172A"/>
-                <w:sz w:val="17"/>
-              </w:rPr>
-              <w:t>Front- und Back-Office</w:t>
+              <w:t>Obst- und Gemüse Karow</w:t>
             </w:r>
             <w:r>
               <w:rPr>
@@ -960,12 +796,12 @@
                 <w:color w:val="0F172A"/>
                 <w:sz w:val="17"/>
               </w:rPr>
-              <w:t>, Guest Relations sowie professionelles Beschwerdemanagement.</w:t>
+              <w:t>, Berlin</w:t>
             </w:r>
           </w:p>
           <w:p>
             <w:pPr>
-              <w:spacing w:after="24"/>
+              <w:spacing w:after="20"/>
               <w:ind w:left="198" w:hanging="198"/>
             </w:pPr>
             <w:r>
@@ -973,154 +809,9 @@
                 <w:rFonts w:ascii="Segoe UI" w:hAnsi="Segoe UI"/>
                 <w:b w:val="0"/>
                 <w:color w:val="0F172A"/>
-                <w:sz w:val="17"/>
+                <w:sz w:val="16"/>
               </w:rPr>
-              <w:t xml:space="preserve">•  Mitwirkung in der </w:t>
-            </w:r>
-            <w:r>
-              <w:rPr>
-                <w:rFonts w:ascii="Segoe UI" w:hAnsi="Segoe UI"/>
-                <w:b/>
-                <w:color w:val="0F172A"/>
-                <w:sz w:val="17"/>
-              </w:rPr>
-              <w:t>Buchhaltung und Vertragsverwaltung</w:t>
-            </w:r>
-            <w:r>
-              <w:rPr>
-                <w:rFonts w:ascii="Segoe UI" w:hAnsi="Segoe UI"/>
-                <w:b w:val="0"/>
-                <w:color w:val="0F172A"/>
-                <w:sz w:val="17"/>
-              </w:rPr>
-              <w:t xml:space="preserve"> sowie stellvertretende Leitung im Bereich Housekeeping.</w:t>
-            </w:r>
-          </w:p>
-        </w:tc>
-      </w:tr>
-      <w:tr>
-        <w:tc>
-          <w:tcPr>
-            <w:tcW w:type="dxa" w:w="1644"/>
-            <w:tcMar>
-              <w:top w:w="25" w:type="dxa"/>
-              <w:bottom w:w="25" w:type="dxa"/>
-              <w:left w:w="0" w:type="dxa"/>
-              <w:right w:w="60" w:type="dxa"/>
-            </w:tcMar>
-          </w:tcPr>
-          <w:p>
-            <w:pPr>
-              <w:spacing w:after="0"/>
-            </w:pPr>
-            <w:r>
-              <w:rPr>
-                <w:rFonts w:ascii="Segoe UI" w:hAnsi="Segoe UI"/>
-                <w:b/>
-                <w:color w:val="475569"/>
-                <w:sz w:val="17"/>
-              </w:rPr>
-              <w:t>2013 – 2025</w:t>
-            </w:r>
-          </w:p>
-        </w:tc>
-        <w:tc>
-          <w:tcPr>
-            <w:tcW w:type="dxa" w:w="8901"/>
-            <w:tcMar>
-              <w:top w:w="25" w:type="dxa"/>
-              <w:bottom w:w="25" w:type="dxa"/>
-              <w:left w:w="0" w:type="dxa"/>
-              <w:right w:w="0" w:type="dxa"/>
-            </w:tcMar>
-          </w:tcPr>
-          <w:p>
-            <w:pPr>
-              <w:spacing w:after="30"/>
-            </w:pPr>
-            <w:r>
-              <w:rPr>
-                <w:rFonts w:ascii="Segoe UI" w:hAnsi="Segoe UI"/>
-                <w:b/>
-                <w:color w:val="0F172A"/>
-                <w:sz w:val="18"/>
-              </w:rPr>
-              <w:t>Kaufmännische Mitarbeit, Einkauf &amp; Kundenbetreuung</w:t>
-            </w:r>
-            <w:r>
-              <w:rPr>
-                <w:rFonts w:ascii="Segoe UI" w:hAnsi="Segoe UI"/>
-                <w:b w:val="0"/>
-                <w:color w:val="0F172A"/>
-                <w:sz w:val="18"/>
-              </w:rPr>
-              <w:t xml:space="preserve"> | </w:t>
-            </w:r>
-            <w:r>
-              <w:rPr>
-                <w:rFonts w:ascii="Segoe UI" w:hAnsi="Segoe UI"/>
-                <w:b/>
-                <w:color w:val="0F172A"/>
-                <w:sz w:val="18"/>
-              </w:rPr>
-              <w:t>Obst- und Gemüse Karow (Einzelhandels-Familienbetrieb)</w:t>
-            </w:r>
-            <w:r>
-              <w:rPr>
-                <w:rFonts w:ascii="Segoe UI" w:hAnsi="Segoe UI"/>
-                <w:b w:val="0"/>
-                <w:color w:val="0F172A"/>
-                <w:sz w:val="18"/>
-              </w:rPr>
-              <w:t>, Berlin</w:t>
-            </w:r>
-          </w:p>
-          <w:p>
-            <w:pPr>
-              <w:spacing w:after="24"/>
-              <w:ind w:left="198" w:hanging="198"/>
-            </w:pPr>
-            <w:r>
-              <w:rPr>
-                <w:rFonts w:ascii="Segoe UI" w:hAnsi="Segoe UI"/>
-                <w:b w:val="0"/>
-                <w:color w:val="0F172A"/>
-                <w:sz w:val="17"/>
-              </w:rPr>
-              <w:t xml:space="preserve">•  Unterstützung in </w:t>
-            </w:r>
-            <w:r>
-              <w:rPr>
-                <w:rFonts w:ascii="Segoe UI" w:hAnsi="Segoe UI"/>
-                <w:b/>
-                <w:color w:val="0F172A"/>
-                <w:sz w:val="17"/>
-              </w:rPr>
-              <w:t>Einkauf, Warenlogistik, Bestandskontrolle</w:t>
-            </w:r>
-            <w:r>
-              <w:rPr>
-                <w:rFonts w:ascii="Segoe UI" w:hAnsi="Segoe UI"/>
-                <w:b w:val="0"/>
-                <w:color w:val="0F172A"/>
-                <w:sz w:val="17"/>
-              </w:rPr>
-              <w:t xml:space="preserve"> und laufender Qualitätssicherung.</w:t>
-            </w:r>
-          </w:p>
-          <w:p>
-            <w:pPr>
-              <w:spacing w:after="24"/>
-              <w:ind w:left="198" w:hanging="198"/>
-            </w:pPr>
-            <w:r>
-              <w:rPr>
-                <w:rFonts w:ascii="Segoe UI" w:hAnsi="Segoe UI"/>
-                <w:b w:val="0"/>
-                <w:color w:val="0F172A"/>
-                <w:sz w:val="17"/>
-              </w:rPr>
-              <w:t>•  Persönliche Kundenbetreuung, Lieferantenkoordination sowie vorbereitende Kassen- und Tagesabrechnung.</w:t>
+              <w:t>•  Langjährige Mitarbeit in Kundenberatung, Einkauf, Warenpräsentation und Kassenführung.</w:t>
             </w:r>
           </w:p>
         </w:tc>
@@ -1156,12 +847,12 @@
       <w:tr>
         <w:tc>
           <w:tcPr>
-            <w:tcW w:type="dxa" w:w="1644"/>
+            <w:tcW w:type="dxa" w:w="1587"/>
             <w:tcMar>
-              <w:top w:w="20" w:type="dxa"/>
-              <w:bottom w:w="20" w:type="dxa"/>
+              <w:top w:w="16" w:type="dxa"/>
+              <w:bottom w:w="16" w:type="dxa"/>
               <w:left w:w="0" w:type="dxa"/>
-              <w:right w:w="60" w:type="dxa"/>
+              <w:right w:w="50" w:type="dxa"/>
             </w:tcMar>
           </w:tcPr>
           <w:p>
@@ -1173,18 +864,18 @@
                 <w:rFonts w:ascii="Segoe UI" w:hAnsi="Segoe UI"/>
                 <w:b/>
                 <w:color w:val="475569"/>
-                <w:sz w:val="17"/>
+                <w:sz w:val="16"/>
               </w:rPr>
-              <w:t>seit 2026</w:t>
+              <w:t>2026 – heute</w:t>
             </w:r>
           </w:p>
         </w:tc>
         <w:tc>
           <w:tcPr>
-            <w:tcW w:type="dxa" w:w="8901"/>
+            <w:tcW w:type="dxa" w:w="8957"/>
             <w:tcMar>
-              <w:top w:w="20" w:type="dxa"/>
-              <w:bottom w:w="20" w:type="dxa"/>
+              <w:top w:w="16" w:type="dxa"/>
+              <w:bottom w:w="16" w:type="dxa"/>
               <w:left w:w="0" w:type="dxa"/>
               <w:right w:w="0" w:type="dxa"/>
             </w:tcMar>
@@ -1198,18 +889,18 @@
                 <w:rFonts w:ascii="Segoe UI" w:hAnsi="Segoe UI"/>
                 <w:b/>
                 <w:color w:val="0F172A"/>
-                <w:sz w:val="18"/>
+                <w:sz w:val="17"/>
               </w:rPr>
-              <w:t>B.Sc. Informatik (Studium)</w:t>
+              <w:t>Studium - B.Science Informatik</w:t>
             </w:r>
             <w:r>
               <w:rPr>
                 <w:rFonts w:ascii="Segoe UI" w:hAnsi="Segoe UI"/>
                 <w:b w:val="0"/>
                 <w:color w:val="0F172A"/>
-                <w:sz w:val="18"/>
+                <w:sz w:val="17"/>
               </w:rPr>
-              <w:t xml:space="preserve"> | Technische Universität Berlin (Campus Charlottenburg / Zoologischer Garten)</w:t>
+              <w:t xml:space="preserve"> | Technische Universität Berlin</w:t>
             </w:r>
           </w:p>
           <w:p>
@@ -1223,7 +914,7 @@
                 <w:color w:val="475569"/>
                 <w:sz w:val="16"/>
               </w:rPr>
-              <w:t>Aktives Vollzeitstudium direkt am Standort Zoologischer Garten / Ernst-Reuter-Platz</w:t>
+              <w:t>Campus Charlottenburg / Zoologischer Garten</w:t>
             </w:r>
           </w:p>
         </w:tc>
@@ -1231,12 +922,12 @@
       <w:tr>
         <w:tc>
           <w:tcPr>
-            <w:tcW w:type="dxa" w:w="1644"/>
+            <w:tcW w:type="dxa" w:w="1587"/>
             <w:tcMar>
-              <w:top w:w="20" w:type="dxa"/>
-              <w:bottom w:w="20" w:type="dxa"/>
+              <w:top w:w="16" w:type="dxa"/>
+              <w:bottom w:w="16" w:type="dxa"/>
               <w:left w:w="0" w:type="dxa"/>
-              <w:right w:w="60" w:type="dxa"/>
+              <w:right w:w="50" w:type="dxa"/>
             </w:tcMar>
           </w:tcPr>
           <w:p>
@@ -1248,7 +939,7 @@
                 <w:rFonts w:ascii="Segoe UI" w:hAnsi="Segoe UI"/>
                 <w:b/>
                 <w:color w:val="475569"/>
-                <w:sz w:val="17"/>
+                <w:sz w:val="16"/>
               </w:rPr>
               <w:t>2019 – 2023</w:t>
             </w:r>
@@ -1256,10 +947,10 @@
         </w:tc>
         <w:tc>
           <w:tcPr>
-            <w:tcW w:type="dxa" w:w="8901"/>
+            <w:tcW w:type="dxa" w:w="8957"/>
             <w:tcMar>
-              <w:top w:w="20" w:type="dxa"/>
-              <w:bottom w:w="20" w:type="dxa"/>
+              <w:top w:w="16" w:type="dxa"/>
+              <w:bottom w:w="16" w:type="dxa"/>
               <w:left w:w="0" w:type="dxa"/>
               <w:right w:w="0" w:type="dxa"/>
             </w:tcMar>
@@ -1273,18 +964,18 @@
                 <w:rFonts w:ascii="Segoe UI" w:hAnsi="Segoe UI"/>
                 <w:b/>
                 <w:color w:val="0F172A"/>
-                <w:sz w:val="18"/>
+                <w:sz w:val="17"/>
               </w:rPr>
-              <w:t>B.A. Business Administration (Duales Studium)</w:t>
+              <w:t>Duales Studium - B.A. Betriebswirtschaftslehre</w:t>
             </w:r>
             <w:r>
               <w:rPr>
                 <w:rFonts w:ascii="Segoe UI" w:hAnsi="Segoe UI"/>
                 <w:b w:val="0"/>
                 <w:color w:val="0F172A"/>
-                <w:sz w:val="18"/>
+                <w:sz w:val="17"/>
               </w:rPr>
-              <w:t xml:space="preserve"> | VICTORIA – Internationale Hochschule, Berlin (Praxispartner: Accor Hotels)</w:t>
+              <w:t xml:space="preserve"> | VICTORIA University, Berlin | ACCOR Hotels</w:t>
             </w:r>
           </w:p>
           <w:p>
@@ -1298,7 +989,7 @@
                 <w:color w:val="475569"/>
                 <w:sz w:val="16"/>
               </w:rPr>
-              <w:t>Vertiefung: Hotel- &amp; Tourismusmanagement | Auslandssemester 2021–2022: Universidad de Girona, Spanien (Marketing &amp; PR)</w:t>
+              <w:t>Vertiefung: Hotelmanagement und Tourismuswirtschaft</w:t>
             </w:r>
           </w:p>
         </w:tc>
@@ -1306,12 +997,12 @@
       <w:tr>
         <w:tc>
           <w:tcPr>
-            <w:tcW w:type="dxa" w:w="1644"/>
+            <w:tcW w:type="dxa" w:w="1587"/>
             <w:tcMar>
-              <w:top w:w="20" w:type="dxa"/>
-              <w:bottom w:w="20" w:type="dxa"/>
+              <w:top w:w="16" w:type="dxa"/>
+              <w:bottom w:w="16" w:type="dxa"/>
               <w:left w:w="0" w:type="dxa"/>
-              <w:right w:w="60" w:type="dxa"/>
+              <w:right w:w="50" w:type="dxa"/>
             </w:tcMar>
           </w:tcPr>
           <w:p>
@@ -1323,18 +1014,18 @@
                 <w:rFonts w:ascii="Segoe UI" w:hAnsi="Segoe UI"/>
                 <w:b/>
                 <w:color w:val="475569"/>
-                <w:sz w:val="17"/>
+                <w:sz w:val="16"/>
               </w:rPr>
-              <w:t>2013 – 2019</w:t>
+              <w:t>2021 – 2022</w:t>
             </w:r>
           </w:p>
         </w:tc>
         <w:tc>
           <w:tcPr>
-            <w:tcW w:type="dxa" w:w="8901"/>
+            <w:tcW w:type="dxa" w:w="8957"/>
             <w:tcMar>
-              <w:top w:w="20" w:type="dxa"/>
-              <w:bottom w:w="20" w:type="dxa"/>
+              <w:top w:w="16" w:type="dxa"/>
+              <w:bottom w:w="16" w:type="dxa"/>
               <w:left w:w="0" w:type="dxa"/>
               <w:right w:w="0" w:type="dxa"/>
             </w:tcMar>
@@ -1348,18 +1039,32 @@
                 <w:rFonts w:ascii="Segoe UI" w:hAnsi="Segoe UI"/>
                 <w:b/>
                 <w:color w:val="0F172A"/>
-                <w:sz w:val="18"/>
+                <w:sz w:val="17"/>
               </w:rPr>
-              <w:t>Allgemeine Hochschulreife (Abitur – Gesamtnote: 1,7)</w:t>
+              <w:t>Auslandssemester</w:t>
             </w:r>
             <w:r>
               <w:rPr>
                 <w:rFonts w:ascii="Segoe UI" w:hAnsi="Segoe UI"/>
                 <w:b w:val="0"/>
                 <w:color w:val="0F172A"/>
-                <w:sz w:val="18"/>
+                <w:sz w:val="17"/>
               </w:rPr>
-              <w:t xml:space="preserve"> | Robert-Havemann-Gymnasium, Berlin</w:t>
+              <w:t xml:space="preserve"> | Universidad de Girona, Spanien</w:t>
+            </w:r>
+          </w:p>
+          <w:p>
+            <w:pPr>
+              <w:spacing w:after="20"/>
+            </w:pPr>
+            <w:r>
+              <w:rPr>
+                <w:rFonts w:ascii="Segoe UI" w:hAnsi="Segoe UI"/>
+                <w:b w:val="0"/>
+                <w:color w:val="475569"/>
+                <w:sz w:val="16"/>
+              </w:rPr>
+              <w:t>Studieninhalte: Marketing, Public Relations &amp; Tourismus</w:t>
             </w:r>
           </w:p>
         </w:tc>
@@ -1384,37 +1089,37 @@
     </w:p>
     <w:p>
       <w:pPr>
-        <w:spacing w:after="50"/>
+        <w:spacing w:after="40"/>
       </w:pPr>
       <w:r>
         <w:rPr>
           <w:rFonts w:ascii="Segoe UI" w:hAnsi="Segoe UI"/>
           <w:b/>
           <w:color w:val="0F172A"/>
-          <w:sz w:val="17"/>
+          <w:sz w:val="16"/>
         </w:rPr>
-        <w:t>Office &amp; Administration:</w:t>
+        <w:t>Office &amp; Organisation:</w:t>
       </w:r>
       <w:r>
         <w:rPr>
           <w:rFonts w:ascii="Segoe UI" w:hAnsi="Segoe UI"/>
           <w:b w:val="0"/>
           <w:color w:val="0F172A"/>
-          <w:sz w:val="17"/>
+          <w:sz w:val="16"/>
         </w:rPr>
-        <w:t xml:space="preserve"> Sekretariats- &amp; Kanzleiorganisation | Angebots- &amp; Rechnungserstellung | Vorbereitende Buchhaltung &amp; Lohnabrechnung | Termin-, Reise- &amp; Eventmanagement | Recruiting &amp; Onboarding | Prozessoptimierung &amp; Qualitätsmanagement</w:t>
+        <w:t xml:space="preserve"> Office Management &amp; Organisation · Projektleitung, Teamführung &amp; Koordination · Eventplanung · Personalplanung · Abrechnungswesen · Front Office Operations · Stakeholder-Management · IT-Prozessoptimierung &amp; Implementierung · Marketing &amp; Videoediting</w:t>
       </w:r>
     </w:p>
     <w:p>
       <w:pPr>
-        <w:spacing w:after="50"/>
+        <w:spacing w:after="40"/>
       </w:pPr>
       <w:r>
         <w:rPr>
           <w:rFonts w:ascii="Segoe UI" w:hAnsi="Segoe UI"/>
           <w:b/>
           <w:color w:val="0F172A"/>
-          <w:sz w:val="17"/>
+          <w:sz w:val="16"/>
         </w:rPr>
         <w:t>Software &amp; IT:</w:t>
       </w:r>
@@ -1423,21 +1128,44 @@
           <w:rFonts w:ascii="Segoe UI" w:hAnsi="Segoe UI"/>
           <w:b w:val="0"/>
           <w:color w:val="0F172A"/>
-          <w:sz w:val="17"/>
+          <w:sz w:val="16"/>
         </w:rPr>
-        <w:t xml:space="preserve"> Microsoft Office 365 (Excel, Word, PowerPoint, Outlook – fortgeschritten) | Google Workspace | Digitale Akten- &amp; Dokumentenverwaltung | HTML &amp; CSS (gut) | Python (Grundkenntnisse) | DaVinci Resolve &amp; Adobe Audition</w:t>
+        <w:t xml:space="preserve"> Microsoft Office (Word, Excel, PowerPoint – Fortgeschritten) · HTML, CSS, Python (Grundlagen)</w:t>
       </w:r>
     </w:p>
     <w:p>
       <w:pPr>
-        <w:spacing w:after="50"/>
+        <w:spacing w:after="40"/>
       </w:pPr>
       <w:r>
         <w:rPr>
           <w:rFonts w:ascii="Segoe UI" w:hAnsi="Segoe UI"/>
           <w:b/>
           <w:color w:val="0F172A"/>
-          <w:sz w:val="17"/>
+          <w:sz w:val="16"/>
+        </w:rPr>
+        <w:t>Film &amp; Audio:</w:t>
+      </w:r>
+      <w:r>
+        <w:rPr>
+          <w:rFonts w:ascii="Segoe UI" w:hAnsi="Segoe UI"/>
+          <w:b w:val="0"/>
+          <w:color w:val="0F172A"/>
+          <w:sz w:val="16"/>
+        </w:rPr>
+        <w:t xml:space="preserve"> DaVinci Resolve · Wondershare Filmora · Adobe Audition CC 2019</w:t>
+      </w:r>
+    </w:p>
+    <w:p>
+      <w:pPr>
+        <w:spacing w:after="40"/>
+      </w:pPr>
+      <w:r>
+        <w:rPr>
+          <w:rFonts w:ascii="Segoe UI" w:hAnsi="Segoe UI"/>
+          <w:b/>
+          <w:color w:val="0F172A"/>
+          <w:sz w:val="16"/>
         </w:rPr>
         <w:t>Sprachen:</w:t>
       </w:r>
@@ -1446,7 +1174,7 @@
           <w:rFonts w:ascii="Segoe UI" w:hAnsi="Segoe UI"/>
           <w:b w:val="0"/>
           <w:color w:val="0F172A"/>
-          <w:sz w:val="17"/>
+          <w:sz w:val="16"/>
         </w:rPr>
         <w:t xml:space="preserve"> </w:t>
       </w:r>
@@ -1455,7 +1183,7 @@
           <w:rFonts w:ascii="Segoe UI" w:hAnsi="Segoe UI"/>
           <w:b/>
           <w:color w:val="0F172A"/>
-          <w:sz w:val="17"/>
+          <w:sz w:val="16"/>
         </w:rPr>
         <w:t>Deutsch:</w:t>
       </w:r>
@@ -1464,7 +1192,7 @@
           <w:rFonts w:ascii="Segoe UI" w:hAnsi="Segoe UI"/>
           <w:b w:val="0"/>
           <w:color w:val="0F172A"/>
-          <w:sz w:val="17"/>
+          <w:sz w:val="16"/>
         </w:rPr>
         <w:t xml:space="preserve"> Muttersprache  •  </w:t>
       </w:r>
@@ -1473,7 +1201,7 @@
           <w:rFonts w:ascii="Segoe UI" w:hAnsi="Segoe UI"/>
           <w:b/>
           <w:color w:val="0F172A"/>
-          <w:sz w:val="17"/>
+          <w:sz w:val="16"/>
         </w:rPr>
         <w:t>Vietnamesisch:</w:t>
       </w:r>
@@ -1482,7 +1210,7 @@
           <w:rFonts w:ascii="Segoe UI" w:hAnsi="Segoe UI"/>
           <w:b w:val="0"/>
           <w:color w:val="0F172A"/>
-          <w:sz w:val="17"/>
+          <w:sz w:val="16"/>
         </w:rPr>
         <w:t xml:space="preserve"> Muttersprache  •  </w:t>
       </w:r>
@@ -1491,7 +1219,7 @@
           <w:rFonts w:ascii="Segoe UI" w:hAnsi="Segoe UI"/>
           <w:b/>
           <w:color w:val="0F172A"/>
-          <w:sz w:val="17"/>
+          <w:sz w:val="16"/>
         </w:rPr>
         <w:t>Englisch:</w:t>
       </w:r>
@@ -1500,16 +1228,16 @@
           <w:rFonts w:ascii="Segoe UI" w:hAnsi="Segoe UI"/>
           <w:b w:val="0"/>
           <w:color w:val="0F172A"/>
-          <w:sz w:val="17"/>
+          <w:sz w:val="16"/>
         </w:rPr>
-        <w:t xml:space="preserve"> C2 (Verhandlungssicher / Proficient)  •  </w:t>
+        <w:t xml:space="preserve"> C2 Proficient  •  </w:t>
       </w:r>
       <w:r>
         <w:rPr>
           <w:rFonts w:ascii="Segoe UI" w:hAnsi="Segoe UI"/>
           <w:b/>
           <w:color w:val="0F172A"/>
-          <w:sz w:val="17"/>
+          <w:sz w:val="16"/>
         </w:rPr>
         <w:t>Spanisch:</w:t>
       </w:r>
@@ -1518,16 +1246,16 @@
           <w:rFonts w:ascii="Segoe UI" w:hAnsi="Segoe UI"/>
           <w:b w:val="0"/>
           <w:color w:val="0F172A"/>
-          <w:sz w:val="17"/>
+          <w:sz w:val="16"/>
         </w:rPr>
-        <w:t xml:space="preserve"> B1 (Erprobte Kenntnisse / Auslandssemester)  •  </w:t>
+        <w:t xml:space="preserve"> B1-Modulzeugnis  •  </w:t>
       </w:r>
       <w:r>
         <w:rPr>
           <w:rFonts w:ascii="Segoe UI" w:hAnsi="Segoe UI"/>
           <w:b/>
           <w:color w:val="0F172A"/>
-          <w:sz w:val="17"/>
+          <w:sz w:val="16"/>
         </w:rPr>
         <w:t>Katalanisch:</w:t>
       </w:r>
@@ -1536,32 +1264,32 @@
           <w:rFonts w:ascii="Segoe UI" w:hAnsi="Segoe UI"/>
           <w:b w:val="0"/>
           <w:color w:val="0F172A"/>
-          <w:sz w:val="17"/>
+          <w:sz w:val="16"/>
         </w:rPr>
-        <w:t xml:space="preserve"> A1 (Zertifikat)</w:t>
+        <w:t xml:space="preserve"> A1-Zertifikat</w:t>
       </w:r>
     </w:p>
     <w:p>
       <w:pPr>
-        <w:spacing w:after="50"/>
+        <w:spacing w:after="40"/>
       </w:pPr>
       <w:r>
         <w:rPr>
           <w:rFonts w:ascii="Segoe UI" w:hAnsi="Segoe UI"/>
           <w:b/>
           <w:color w:val="0F172A"/>
-          <w:sz w:val="17"/>
+          <w:sz w:val="16"/>
         </w:rPr>
-        <w:t>Sonstiges:</w:t>
+        <w:t>Nachweise &amp; Mobilität:</w:t>
       </w:r>
       <w:r>
         <w:rPr>
           <w:rFonts w:ascii="Segoe UI" w:hAnsi="Segoe UI"/>
           <w:b w:val="0"/>
           <w:color w:val="0F172A"/>
-          <w:sz w:val="17"/>
+          <w:sz w:val="16"/>
         </w:rPr>
-        <w:t xml:space="preserve"> Führerschein Klasse B | Gesundheitszeugnis vorhanden</w:t>
+        <w:t xml:space="preserve"> Führerschein Klasse B · Gesundheitszeugnis</w:t>
       </w:r>
     </w:p>
     <w:tbl>

</xml_diff>

<commit_message>
fix: eliminate empty void on Nancy Master PDF, modernize Guillermo cover letter (remove emdashes, millions of calls, organic skills narrative)
</commit_message>
<xml_diff>
--- a/docs/files/Nancy_Schuetze_Lebenslauf_Master.docx
+++ b/docs/files/Nancy_Schuetze_Lebenslauf_Master.docx
@@ -248,115 +248,6 @@
                 <w:color w:val="475569"/>
                 <w:sz w:val="16"/>
               </w:rPr>
-              <w:t>2019 – heute</w:t>
-            </w:r>
-          </w:p>
-        </w:tc>
-        <w:tc>
-          <w:tcPr>
-            <w:tcW w:type="dxa" w:w="8957"/>
-            <w:tcMar>
-              <w:top w:w="18" w:type="dxa"/>
-              <w:bottom w:w="18" w:type="dxa"/>
-              <w:left w:w="0" w:type="dxa"/>
-              <w:right w:w="0" w:type="dxa"/>
-            </w:tcMar>
-          </w:tcPr>
-          <w:p>
-            <w:pPr>
-              <w:spacing w:after="20"/>
-            </w:pPr>
-            <w:r>
-              <w:rPr>
-                <w:rFonts w:ascii="Segoe UI" w:hAnsi="Segoe UI"/>
-                <w:b/>
-                <w:color w:val="0F172A"/>
-                <w:sz w:val="17"/>
-              </w:rPr>
-              <w:t>Projektleitung, Teamleitung, Hostess &amp; Promotorin</w:t>
-            </w:r>
-            <w:r>
-              <w:rPr>
-                <w:rFonts w:ascii="Segoe UI" w:hAnsi="Segoe UI"/>
-                <w:b w:val="0"/>
-                <w:color w:val="0F172A"/>
-                <w:sz w:val="17"/>
-              </w:rPr>
-              <w:t xml:space="preserve"> | </w:t>
-            </w:r>
-            <w:r>
-              <w:rPr>
-                <w:rFonts w:ascii="Segoe UI" w:hAnsi="Segoe UI"/>
-                <w:b/>
-                <w:color w:val="0F172A"/>
-                <w:sz w:val="17"/>
-              </w:rPr>
-              <w:t>verschiedene Agenturen</w:t>
-            </w:r>
-            <w:r>
-              <w:rPr>
-                <w:rFonts w:ascii="Segoe UI" w:hAnsi="Segoe UI"/>
-                <w:b w:val="0"/>
-                <w:color w:val="0F172A"/>
-                <w:sz w:val="17"/>
-              </w:rPr>
-              <w:t>, Berlin &amp; bundesweit</w:t>
-            </w:r>
-          </w:p>
-          <w:p>
-            <w:pPr>
-              <w:spacing w:after="20"/>
-              <w:ind w:left="198" w:hanging="198"/>
-            </w:pPr>
-            <w:r>
-              <w:rPr>
-                <w:rFonts w:ascii="Segoe UI" w:hAnsi="Segoe UI"/>
-                <w:b w:val="0"/>
-                <w:color w:val="0F172A"/>
-                <w:sz w:val="16"/>
-              </w:rPr>
-              <w:t>•  Eigenständige Koordination von Vor-Ort-Teams von bis zu 60 Personen bei Events, Messen und Kongressen.</w:t>
-            </w:r>
-          </w:p>
-          <w:p>
-            <w:pPr>
-              <w:spacing w:after="20"/>
-              <w:ind w:left="198" w:hanging="198"/>
-            </w:pPr>
-            <w:r>
-              <w:rPr>
-                <w:rFonts w:ascii="Segoe UI" w:hAnsi="Segoe UI"/>
-                <w:b w:val="0"/>
-                <w:color w:val="0F172A"/>
-                <w:sz w:val="16"/>
-              </w:rPr>
-              <w:t>•  Zentrale Ansprechpartnerin für Kunden und Auftraggeber zur Sicherstellung eines reibungslosen Ablaufs.</w:t>
-            </w:r>
-          </w:p>
-        </w:tc>
-      </w:tr>
-      <w:tr>
-        <w:tc>
-          <w:tcPr>
-            <w:tcW w:type="dxa" w:w="1587"/>
-            <w:tcMar>
-              <w:top w:w="18" w:type="dxa"/>
-              <w:bottom w:w="18" w:type="dxa"/>
-              <w:left w:w="0" w:type="dxa"/>
-              <w:right w:w="50" w:type="dxa"/>
-            </w:tcMar>
-          </w:tcPr>
-          <w:p>
-            <w:pPr>
-              <w:spacing w:after="0"/>
-            </w:pPr>
-            <w:r>
-              <w:rPr>
-                <w:rFonts w:ascii="Segoe UI" w:hAnsi="Segoe UI"/>
-                <w:b/>
-                <w:color w:val="475569"/>
-                <w:sz w:val="16"/>
-              </w:rPr>
               <w:t>2025 – 2026</w:t>
             </w:r>
           </w:p>
@@ -382,7 +273,7 @@
                 <w:color w:val="0F172A"/>
                 <w:sz w:val="17"/>
               </w:rPr>
-              <w:t>Office Manager, Bürofachangestellte</w:t>
+              <w:t>Office Managerin &amp; Kanzleiassistenz</w:t>
             </w:r>
             <w:r>
               <w:rPr>
@@ -424,7 +315,7 @@
                 <w:color w:val="0F172A"/>
                 <w:sz w:val="16"/>
               </w:rPr>
-              <w:t>•  Eigenverantwortliche Organisation und Koordination des Sekretariats- &amp; Kanzleibüros.</w:t>
+              <w:t>•  Eigenverantwortliche Organisation und Steuerung des gesamten Kanzlei- und Sekretariatsbetriebs.</w:t>
             </w:r>
           </w:p>
           <w:p>
@@ -439,7 +330,7 @@
                 <w:color w:val="0F172A"/>
                 <w:sz w:val="16"/>
               </w:rPr>
-              <w:t>•  Professionelle Kommunikation mit Mandanten &amp; Behörden (in deutscher &amp; englischer Sprache auf C2-Niveau).</w:t>
+              <w:t>•  Professionelle schriftliche und telefonische Kommunikation mit Mandanten, Gerichten und Behörden auf Deutsch und Englisch (C2).</w:t>
             </w:r>
           </w:p>
           <w:p>
@@ -454,7 +345,22 @@
                 <w:color w:val="0F172A"/>
                 <w:sz w:val="16"/>
               </w:rPr>
-              <w:t>•  Optimierung von internen IT-Prozessen, digitale Dokumentenverwaltung &amp; Qualitätssicherung.</w:t>
+              <w:t>•  Strukturierte Dokumentenorganisation, Fristenkontrolle, Aktenführung sowie vorbereitende Buchhaltung und Rechnungserstellung.</w:t>
+            </w:r>
+          </w:p>
+          <w:p>
+            <w:pPr>
+              <w:spacing w:after="20"/>
+              <w:ind w:left="198" w:hanging="198"/>
+            </w:pPr>
+            <w:r>
+              <w:rPr>
+                <w:rFonts w:ascii="Segoe UI" w:hAnsi="Segoe UI"/>
+                <w:b w:val="0"/>
+                <w:color w:val="0F172A"/>
+                <w:sz w:val="16"/>
+              </w:rPr>
+              <w:t>•  Kontinuierliche Prozessoptimierung, Digitalisierung von Büroabläufen und Qualitätsmanagement.</w:t>
             </w:r>
           </w:p>
         </w:tc>
@@ -506,7 +412,7 @@
                 <w:color w:val="0F172A"/>
                 <w:sz w:val="17"/>
               </w:rPr>
-              <w:t>Junior Projektleitung</w:t>
+              <w:t>Junior Projektleitung &amp; Office Operations</w:t>
             </w:r>
             <w:r>
               <w:rPr>
@@ -548,7 +454,7 @@
                 <w:color w:val="0F172A"/>
                 <w:sz w:val="16"/>
               </w:rPr>
-              <w:t>•  Event- &amp; Personalplanung für führende Marken wie Coca-Cola sowie Großevents wie die Volkswagen Drive Experience zur Fußball-EM 2024.</w:t>
+              <w:t>•  Kaufmännische und organisatorische Planung von Projekten inklusive Personal-, Event- und Budgetsteuerung.</w:t>
             </w:r>
           </w:p>
           <w:p>
@@ -563,7 +469,7 @@
                 <w:color w:val="0F172A"/>
                 <w:sz w:val="16"/>
               </w:rPr>
-              <w:t>•  Allgemeine Organisation des Büros sowie administrative Unterstützung der Geschäftsführung.</w:t>
+              <w:t>•  Interne Koordination, Einsatzplanung sowie Mitarbeiterabrechnungen für Werkstudierende und Aushilfen.</w:t>
             </w:r>
           </w:p>
           <w:p>
@@ -578,7 +484,7 @@
                 <w:color w:val="0F172A"/>
                 <w:sz w:val="16"/>
               </w:rPr>
-              <w:t>•  Koordination, Einsatzplanung und Betreuung von Werkstudenten &amp; Aushilfen.</w:t>
+              <w:t>•  Eigenständige Angebotskalkulation und Rechnungserstellung sowie Kunden- und Dienstleisterbetreuung.</w:t>
             </w:r>
           </w:p>
           <w:p>
@@ -593,7 +499,86 @@
                 <w:color w:val="0F172A"/>
                 <w:sz w:val="16"/>
               </w:rPr>
-              <w:t>•  Kaufmännische Angebotserstellung, Abrechnungswesen &amp; vorbereitende Buchhaltung.</w:t>
+              <w:t>•  Weiterentwicklung interner Verwaltungsstrukturen durch Digitalisierung und Prozessoptimierung.</w:t>
+            </w:r>
+          </w:p>
+        </w:tc>
+      </w:tr>
+      <w:tr>
+        <w:tc>
+          <w:tcPr>
+            <w:tcW w:type="dxa" w:w="1587"/>
+            <w:tcMar>
+              <w:top w:w="18" w:type="dxa"/>
+              <w:bottom w:w="18" w:type="dxa"/>
+              <w:left w:w="0" w:type="dxa"/>
+              <w:right w:w="50" w:type="dxa"/>
+            </w:tcMar>
+          </w:tcPr>
+          <w:p>
+            <w:pPr>
+              <w:spacing w:after="0"/>
+            </w:pPr>
+            <w:r>
+              <w:rPr>
+                <w:rFonts w:ascii="Segoe UI" w:hAnsi="Segoe UI"/>
+                <w:b/>
+                <w:color w:val="475569"/>
+                <w:sz w:val="16"/>
+              </w:rPr>
+              <w:t>2019 – heute</w:t>
+            </w:r>
+          </w:p>
+        </w:tc>
+        <w:tc>
+          <w:tcPr>
+            <w:tcW w:type="dxa" w:w="8957"/>
+            <w:tcMar>
+              <w:top w:w="18" w:type="dxa"/>
+              <w:bottom w:w="18" w:type="dxa"/>
+              <w:left w:w="0" w:type="dxa"/>
+              <w:right w:w="0" w:type="dxa"/>
+            </w:tcMar>
+          </w:tcPr>
+          <w:p>
+            <w:pPr>
+              <w:spacing w:after="20"/>
+            </w:pPr>
+            <w:r>
+              <w:rPr>
+                <w:rFonts w:ascii="Segoe UI" w:hAnsi="Segoe UI"/>
+                <w:b/>
+                <w:color w:val="0F172A"/>
+                <w:sz w:val="17"/>
+              </w:rPr>
+              <w:t>Teamleitung Events, Hostess &amp; Promotion (Nebenberuflich)</w:t>
+            </w:r>
+            <w:r>
+              <w:rPr>
+                <w:rFonts w:ascii="Segoe UI" w:hAnsi="Segoe UI"/>
+                <w:b w:val="0"/>
+                <w:color w:val="0F172A"/>
+                <w:sz w:val="17"/>
+              </w:rPr>
+              <w:t xml:space="preserve"> | </w:t>
+            </w:r>
+            <w:r>
+              <w:rPr>
+                <w:rFonts w:ascii="Segoe UI" w:hAnsi="Segoe UI"/>
+                <w:b/>
+                <w:color w:val="0F172A"/>
+                <w:sz w:val="17"/>
+              </w:rPr>
+              <w:t>Verschiedene Event- und Promotionagenturen</w:t>
+            </w:r>
+            <w:r>
+              <w:rPr>
+                <w:rFonts w:ascii="Segoe UI" w:hAnsi="Segoe UI"/>
+                <w:b w:val="0"/>
+                <w:color w:val="0F172A"/>
+                <w:sz w:val="17"/>
+              </w:rPr>
+              <w:t>, Berlin &amp; bundesweit</w:t>
             </w:r>
           </w:p>
           <w:p>
@@ -608,7 +593,131 @@
                 <w:color w:val="0F172A"/>
                 <w:sz w:val="16"/>
               </w:rPr>
-              <w:t>•  Implementierung neuer digitaler IT-Prozesse zur Workflow-Optimierung.</w:t>
+              <w:t>•  Vor-Ort-Teamleitung: Check-In, Briefing und Koordination der Einsatzteams bei Messen, Kongressen und Corporate Events.</w:t>
+            </w:r>
+          </w:p>
+          <w:p>
+            <w:pPr>
+              <w:spacing w:after="20"/>
+              <w:ind w:left="198" w:hanging="198"/>
+            </w:pPr>
+            <w:r>
+              <w:rPr>
+                <w:rFonts w:ascii="Segoe UI" w:hAnsi="Segoe UI"/>
+                <w:b w:val="0"/>
+                <w:color w:val="0F172A"/>
+                <w:sz w:val="16"/>
+              </w:rPr>
+              <w:t>•  Direkte Ansprechpartnerin für Auftraggeber vor Ort sowie Sicherstellung eines reibungslosen Serviceablaufs.</w:t>
+            </w:r>
+          </w:p>
+        </w:tc>
+      </w:tr>
+      <w:tr>
+        <w:tc>
+          <w:tcPr>
+            <w:tcW w:type="dxa" w:w="1587"/>
+            <w:tcMar>
+              <w:top w:w="18" w:type="dxa"/>
+              <w:bottom w:w="18" w:type="dxa"/>
+              <w:left w:w="0" w:type="dxa"/>
+              <w:right w:w="50" w:type="dxa"/>
+            </w:tcMar>
+          </w:tcPr>
+          <w:p>
+            <w:pPr>
+              <w:spacing w:after="0"/>
+            </w:pPr>
+            <w:r>
+              <w:rPr>
+                <w:rFonts w:ascii="Segoe UI" w:hAnsi="Segoe UI"/>
+                <w:b/>
+                <w:color w:val="475569"/>
+                <w:sz w:val="16"/>
+              </w:rPr>
+              <w:t>2021 – 2022</w:t>
+            </w:r>
+          </w:p>
+        </w:tc>
+        <w:tc>
+          <w:tcPr>
+            <w:tcW w:type="dxa" w:w="8957"/>
+            <w:tcMar>
+              <w:top w:w="18" w:type="dxa"/>
+              <w:bottom w:w="18" w:type="dxa"/>
+              <w:left w:w="0" w:type="dxa"/>
+              <w:right w:w="0" w:type="dxa"/>
+            </w:tcMar>
+          </w:tcPr>
+          <w:p>
+            <w:pPr>
+              <w:spacing w:after="20"/>
+            </w:pPr>
+            <w:r>
+              <w:rPr>
+                <w:rFonts w:ascii="Segoe UI" w:hAnsi="Segoe UI"/>
+                <w:b/>
+                <w:color w:val="0F172A"/>
+                <w:sz w:val="17"/>
+              </w:rPr>
+              <w:t>Werkstudentin Qualitätsmanagement, Recruiting &amp; PR</w:t>
+            </w:r>
+            <w:r>
+              <w:rPr>
+                <w:rFonts w:ascii="Segoe UI" w:hAnsi="Segoe UI"/>
+                <w:b w:val="0"/>
+                <w:color w:val="0F172A"/>
+                <w:sz w:val="17"/>
+              </w:rPr>
+              <w:t xml:space="preserve"> | </w:t>
+            </w:r>
+            <w:r>
+              <w:rPr>
+                <w:rFonts w:ascii="Segoe UI" w:hAnsi="Segoe UI"/>
+                <w:b/>
+                <w:color w:val="0F172A"/>
+                <w:sz w:val="17"/>
+              </w:rPr>
+              <w:t>Vergleich.org (VGL Publishing AG)</w:t>
+            </w:r>
+            <w:r>
+              <w:rPr>
+                <w:rFonts w:ascii="Segoe UI" w:hAnsi="Segoe UI"/>
+                <w:b w:val="0"/>
+                <w:color w:val="0F172A"/>
+                <w:sz w:val="17"/>
+              </w:rPr>
+              <w:t>, Berlin</w:t>
+            </w:r>
+          </w:p>
+          <w:p>
+            <w:pPr>
+              <w:spacing w:after="20"/>
+              <w:ind w:left="198" w:hanging="198"/>
+            </w:pPr>
+            <w:r>
+              <w:rPr>
+                <w:rFonts w:ascii="Segoe UI" w:hAnsi="Segoe UI"/>
+                <w:b w:val="0"/>
+                <w:color w:val="0F172A"/>
+                <w:sz w:val="16"/>
+              </w:rPr>
+              <w:t>•  Recruiting, Vertragsabwicklung und Onboarding neuer Freelancer sowie Koordination externer Dienstleister.</w:t>
+            </w:r>
+          </w:p>
+          <w:p>
+            <w:pPr>
+              <w:spacing w:after="20"/>
+              <w:ind w:left="198" w:hanging="198"/>
+            </w:pPr>
+            <w:r>
+              <w:rPr>
+                <w:rFonts w:ascii="Segoe UI" w:hAnsi="Segoe UI"/>
+                <w:b w:val="0"/>
+                <w:color w:val="0F172A"/>
+                <w:sz w:val="16"/>
+              </w:rPr>
+              <w:t>•  Qualitätssicherung, Lektorat von Produkttexten sowie technische Pflege von XML- und HTML-Dateien.</w:t>
             </w:r>
           </w:p>
         </w:tc>
@@ -660,7 +769,7 @@
                 <w:color w:val="0F172A"/>
                 <w:sz w:val="17"/>
               </w:rPr>
-              <w:t>Duale Studentin</w:t>
+              <w:t>Duale Studentin – Front &amp; Back Office / Hospitality Management</w:t>
             </w:r>
             <w:r>
               <w:rPr>
@@ -678,7 +787,7 @@
                 <w:color w:val="0F172A"/>
                 <w:sz w:val="17"/>
               </w:rPr>
-              <w:t>Novotel Suites, Ibis und Ibis Budget (ACCOR Hotels)</w:t>
+              <w:t>Accor Hotels (Novotel Suites, Ibis &amp; Ibis Budget)</w:t>
             </w:r>
             <w:r>
               <w:rPr>
@@ -702,7 +811,7 @@
                 <w:color w:val="0F172A"/>
                 <w:sz w:val="16"/>
               </w:rPr>
-              <w:t>•  Praktische Ausbildung und operative Rotation in den Bereichen Front Office, Housekeeping, Service &amp; Bar.</w:t>
+              <w:t>•  Operative Steuerung im Front- und Back-Office, Guest Relations sowie professionelles Beschwerdemanagement.</w:t>
             </w:r>
           </w:p>
           <w:p>
@@ -717,7 +826,7 @@
                 <w:color w:val="0F172A"/>
                 <w:sz w:val="16"/>
               </w:rPr>
-              <w:t>•  Eigenverantwortliche Vertretung der Executive Housekeeperin inklusive Schicht- und Qualitätsleitung.</w:t>
+              <w:t>•  Mitwirkung in der Buchhaltung und Vertragsverwaltung sowie stellvertretende Leitung im Bereich Housekeeping.</w:t>
             </w:r>
           </w:p>
         </w:tc>
@@ -769,7 +878,7 @@
                 <w:color w:val="0F172A"/>
                 <w:sz w:val="17"/>
               </w:rPr>
-              <w:t>Verkäuferin im LEH-Familienbetrieb</w:t>
+              <w:t>Kaufmännische Mitarbeit, Einkauf &amp; Kundenbetreuung</w:t>
             </w:r>
             <w:r>
               <w:rPr>
@@ -787,7 +896,7 @@
                 <w:color w:val="0F172A"/>
                 <w:sz w:val="17"/>
               </w:rPr>
-              <w:t>Obst- und Gemüse Karow</w:t>
+              <w:t>Obst- und Gemüse Karow (Einzelhandels-Familienbetrieb)</w:t>
             </w:r>
             <w:r>
               <w:rPr>
@@ -811,7 +920,22 @@
                 <w:color w:val="0F172A"/>
                 <w:sz w:val="16"/>
               </w:rPr>
-              <w:t>•  Langjährige Mitarbeit in Kundenberatung, Einkauf, Warenpräsentation und Kassenführung.</w:t>
+              <w:t>•  Unterstützung in Einkauf, Warenlogistik, Bestandskontrolle und laufender Qualitätssicherung.</w:t>
+            </w:r>
+          </w:p>
+          <w:p>
+            <w:pPr>
+              <w:spacing w:after="20"/>
+              <w:ind w:left="198" w:hanging="198"/>
+            </w:pPr>
+            <w:r>
+              <w:rPr>
+                <w:rFonts w:ascii="Segoe UI" w:hAnsi="Segoe UI"/>
+                <w:b w:val="0"/>
+                <w:color w:val="0F172A"/>
+                <w:sz w:val="16"/>
+              </w:rPr>
+              <w:t>•  Persönliche Kundenbetreuung, Lieferantenkoordination sowie vorbereitende Kassen- und Tagesabrechnung.</w:t>
             </w:r>
           </w:p>
         </w:tc>
@@ -866,7 +990,7 @@
                 <w:color w:val="475569"/>
                 <w:sz w:val="16"/>
               </w:rPr>
-              <w:t>2026 – heute</w:t>
+              <w:t>seit 2026</w:t>
             </w:r>
           </w:p>
         </w:tc>
@@ -891,7 +1015,7 @@
                 <w:color w:val="0F172A"/>
                 <w:sz w:val="17"/>
               </w:rPr>
-              <w:t>Studium - B.Science Informatik</w:t>
+              <w:t>B.Sc. Informatik (Studium)</w:t>
             </w:r>
             <w:r>
               <w:rPr>
@@ -900,7 +1024,7 @@
                 <w:color w:val="0F172A"/>
                 <w:sz w:val="17"/>
               </w:rPr>
-              <w:t xml:space="preserve"> | Technische Universität Berlin</w:t>
+              <w:t xml:space="preserve"> | Technische Universität Berlin (Campus Charlottenburg / Zoologischer Garten)</w:t>
             </w:r>
           </w:p>
           <w:p>
@@ -914,7 +1038,7 @@
                 <w:color w:val="475569"/>
                 <w:sz w:val="16"/>
               </w:rPr>
-              <w:t>Campus Charlottenburg / Zoologischer Garten</w:t>
+              <w:t>Aktives Vollzeitstudium direkt am Standort Zoologischer Garten / Ernst-Reuter-Platz</w:t>
             </w:r>
           </w:p>
         </w:tc>
@@ -966,7 +1090,7 @@
                 <w:color w:val="0F172A"/>
                 <w:sz w:val="17"/>
               </w:rPr>
-              <w:t>Duales Studium - B.A. Betriebswirtschaftslehre</w:t>
+              <w:t>B.A. Business Administration (Duales Studium)</w:t>
             </w:r>
             <w:r>
               <w:rPr>
@@ -975,7 +1099,7 @@
                 <w:color w:val="0F172A"/>
                 <w:sz w:val="17"/>
               </w:rPr>
-              <w:t xml:space="preserve"> | VICTORIA University, Berlin | ACCOR Hotels</w:t>
+              <w:t xml:space="preserve"> | VICTORIA – Internationale Hochschule, Berlin (Praxispartner: Accor Hotels)</w:t>
             </w:r>
           </w:p>
           <w:p>
@@ -989,7 +1113,7 @@
                 <w:color w:val="475569"/>
                 <w:sz w:val="16"/>
               </w:rPr>
-              <w:t>Vertiefung: Hotelmanagement und Tourismuswirtschaft</w:t>
+              <w:t>Vertiefung: Hotel- &amp; Tourismusmanagement | Auslandssemester 2021–2022: Universidad de Girona, Spanien (Marketing &amp; PR)</w:t>
             </w:r>
           </w:p>
         </w:tc>
@@ -1016,7 +1140,7 @@
                 <w:color w:val="475569"/>
                 <w:sz w:val="16"/>
               </w:rPr>
-              <w:t>2021 – 2022</w:t>
+              <w:t>2013 – 2019</w:t>
             </w:r>
           </w:p>
         </w:tc>
@@ -1041,7 +1165,7 @@
                 <w:color w:val="0F172A"/>
                 <w:sz w:val="17"/>
               </w:rPr>
-              <w:t>Auslandssemester</w:t>
+              <w:t>Allgemeine Hochschulreife (Abitur – Gesamtnote: 1,7)</w:t>
             </w:r>
             <w:r>
               <w:rPr>
@@ -1050,21 +1174,7 @@
                 <w:color w:val="0F172A"/>
                 <w:sz w:val="17"/>
               </w:rPr>
-              <w:t xml:space="preserve"> | Universidad de Girona, Spanien</w:t>
-            </w:r>
-          </w:p>
-          <w:p>
-            <w:pPr>
-              <w:spacing w:after="20"/>
-            </w:pPr>
-            <w:r>
-              <w:rPr>
-                <w:rFonts w:ascii="Segoe UI" w:hAnsi="Segoe UI"/>
-                <w:b w:val="0"/>
-                <w:color w:val="475569"/>
-                <w:sz w:val="16"/>
-              </w:rPr>
-              <w:t>Studieninhalte: Marketing, Public Relations &amp; Tourismus</w:t>
+              <w:t xml:space="preserve"> | Robert-Havemann-Gymnasium, Berlin</w:t>
             </w:r>
           </w:p>
         </w:tc>

</xml_diff>